<commit_message>
update doi mat khau va tong quan
</commit_message>
<xml_diff>
--- a/BaoCao_HocVeo.docx
+++ b/BaoCao_HocVeo.docx
@@ -21,14 +21,18 @@
       <w:pPr>
         <w:spacing w:after="200"/>
         <w:jc w:val="center"/>
+        <w:rPr>
+          <w:sz w:val="40"/>
+          <w:szCs w:val="40"/>
+        </w:rPr>
       </w:pPr>
       <w:r>
         <w:rPr>
           <w:b/>
           <w:bCs/>
           <w:color w:val="C2410C"/>
-          <w:sz w:val="48"/>
-          <w:szCs w:val="48"/>
+          <w:sz w:val="40"/>
+          <w:szCs w:val="40"/>
         </w:rPr>
         <w:t>NỀN TẢNG HỌC TRỰC TUYẾN “HỌC VÈO”</w:t>
       </w:r>
@@ -68,22 +72,69 @@
     </w:p>
     <w:p>
       <w:pPr>
-        <w:spacing w:after="120"/>
-      </w:pPr>
-    </w:p>
-    <w:p>
-      <w:pPr>
         <w:spacing w:after="120" w:line="320" w:lineRule="auto"/>
         <w:jc w:val="center"/>
       </w:pPr>
       <w:r>
-        <w:t>Sinh viên thực hiện: …</w:t>
-      </w:r>
-      <w:r>
-        <w:t>Bùi Thị Kim Thanh</w:t>
-      </w:r>
-      <w:r>
-        <w:t>…………………………………</w:t>
+        <w:rPr>
+          <w:rStyle w:val="fontstyle01"/>
+        </w:rPr>
+        <w:t>Sinh viên thực hiện: …Bùi Thị Kim Thanh…………………………………</w:t>
+      </w:r>
+      <w:r>
+        <w:rPr>
+          <w:rFonts w:ascii="CIDFont+F1" w:hAnsi="CIDFont+F1"/>
+          <w:color w:val="000000"/>
+        </w:rPr>
+        <w:br/>
+      </w:r>
+      <w:r>
+        <w:rPr>
+          <w:rStyle w:val="fontstyle01"/>
+        </w:rPr>
+        <w:t>Giảng viên hướng dẫn: …Thầy Nguyễn Việt Hải…………………………………</w:t>
+      </w:r>
+      <w:r>
+        <w:rPr>
+          <w:rFonts w:ascii="CIDFont+F1" w:hAnsi="CIDFont+F1"/>
+          <w:color w:val="000000"/>
+        </w:rPr>
+        <w:br/>
+      </w:r>
+      <w:r>
+        <w:rPr>
+          <w:rStyle w:val="fontstyle01"/>
+        </w:rPr>
+        <w:t xml:space="preserve">GitHub: </w:t>
+      </w:r>
+      <w:r>
+        <w:rPr>
+          <w:rStyle w:val="fontstyle01"/>
+          <w:color w:val="0563C1"/>
+        </w:rPr>
+        <w:t>https://github.com/buithikimthanh060781-prog/Video_Admin</w:t>
+      </w:r>
+      <w:bookmarkStart w:id="0" w:name="_GoBack"/>
+      <w:bookmarkEnd w:id="0"/>
+      <w:r>
+        <w:rPr>
+          <w:rFonts w:ascii="CIDFont+F1" w:hAnsi="CIDFont+F1"/>
+          <w:color w:val="0563C1"/>
+        </w:rPr>
+        <w:br/>
+      </w:r>
+      <w:r>
+        <w:rPr>
+          <w:rStyle w:val="fontstyle01"/>
+        </w:rPr>
+        <w:t xml:space="preserve">Website: </w:t>
+      </w:r>
+      <w:r>
+        <w:rPr>
+          <w:rStyle w:val="fontstyle01"/>
+          <w:color w:val="0563C1"/>
+        </w:rPr>
+        <w:t>https://video-admin.buithikimthanh060781.workers.dev/login</w:t>
       </w:r>
     </w:p>
     <w:p>
@@ -92,76 +143,6 @@
         <w:jc w:val="center"/>
       </w:pPr>
       <w:r>
-        <w:t>Giảng viên hướng dẫn: …</w:t>
-      </w:r>
-      <w:r>
-        <w:t>Thầy Nguyễn Việt Hải</w:t>
-      </w:r>
-      <w:r>
-        <w:t>…………………………………</w:t>
-      </w:r>
-    </w:p>
-    <w:p>
-      <w:pPr>
-        <w:spacing w:after="120" w:line="320" w:lineRule="auto"/>
-        <w:jc w:val="center"/>
-      </w:pPr>
-      <w:r>
-        <w:t xml:space="preserve">                   GitHub</w:t>
-      </w:r>
-      <w:r>
-        <w:t xml:space="preserve">: </w:t>
-      </w:r>
-      <w:r>
-        <w:t xml:space="preserve"> </w:t>
-      </w:r>
-      <w:hyperlink r:id="rId7" w:history="1">
-        <w:r>
-          <w:rPr>
-            <w:rStyle w:val="Hyperlink"/>
-          </w:rPr>
-          <w:t>https://github.com/buithikimthanh060781-prog/Video_Admin</w:t>
-        </w:r>
-      </w:hyperlink>
-    </w:p>
-    <w:p>
-      <w:pPr>
-        <w:spacing w:after="120" w:line="320" w:lineRule="auto"/>
-        <w:jc w:val="center"/>
-      </w:pPr>
-      <w:r>
-        <w:t xml:space="preserve">          Website</w:t>
-      </w:r>
-      <w:r>
-        <w:t xml:space="preserve">: </w:t>
-      </w:r>
-      <w:hyperlink r:id="rId8" w:history="1">
-        <w:r>
-          <w:rPr>
-            <w:rStyle w:val="Hyperlink"/>
-          </w:rPr>
-          <w:t>https://video-admin.buithikimthanh060781.workers.dev/login</w:t>
-        </w:r>
-      </w:hyperlink>
-    </w:p>
-    <w:p>
-      <w:pPr>
-        <w:spacing w:after="120" w:line="320" w:lineRule="auto"/>
-        <w:jc w:val="center"/>
-      </w:pPr>
-    </w:p>
-    <w:p>
-      <w:pPr>
-        <w:spacing w:after="120" w:line="320" w:lineRule="auto"/>
-        <w:jc w:val="center"/>
-      </w:pPr>
-    </w:p>
-    <w:p>
-      <w:pPr>
-        <w:spacing w:after="120" w:line="320" w:lineRule="auto"/>
-        <w:jc w:val="center"/>
-      </w:pPr>
-      <w:r>
         <w:t>Năm 2026</w:t>
       </w:r>
     </w:p>
@@ -169,8 +150,6 @@
       <w:r>
         <w:br w:type="page"/>
       </w:r>
-      <w:bookmarkStart w:id="0" w:name="_GoBack"/>
-      <w:bookmarkEnd w:id="0"/>
     </w:p>
     <w:p>
       <w:pPr>
@@ -185,16 +164,15 @@
         <w:t>Mô tả dự án</w:t>
       </w:r>
     </w:p>
-    <w:p/>
     <w:p>
       <w:r>
         <w:rPr>
           <w:noProof/>
         </w:rPr>
         <w:drawing>
-          <wp:inline distT="0" distB="0" distL="0" distR="0" wp14:anchorId="44B23F52" wp14:editId="0534097B">
-            <wp:extent cx="5731510" cy="3521075"/>
-            <wp:effectExtent l="0" t="0" r="2540" b="3175"/>
+          <wp:inline distT="0" distB="0" distL="0" distR="0" wp14:anchorId="1B7A41BC" wp14:editId="2BE780D1">
+            <wp:extent cx="5731510" cy="3520440"/>
+            <wp:effectExtent l="0" t="0" r="2540" b="3810"/>
             <wp:docPr id="1" name="Picture 1"/>
             <wp:cNvGraphicFramePr>
               <a:graphicFrameLocks xmlns:a="http://schemas.openxmlformats.org/drawingml/2006/main" noChangeAspect="1"/>
@@ -207,7 +185,7 @@
                     <pic:cNvPicPr/>
                   </pic:nvPicPr>
                   <pic:blipFill>
-                    <a:blip r:embed="rId9"/>
+                    <a:blip r:embed="rId7"/>
                     <a:stretch>
                       <a:fillRect/>
                     </a:stretch>
@@ -215,7 +193,7 @@
                   <pic:spPr>
                     <a:xfrm>
                       <a:off x="0" y="0"/>
-                      <a:ext cx="5731510" cy="3521075"/>
+                      <a:ext cx="5731510" cy="3520440"/>
                     </a:xfrm>
                     <a:prstGeom prst="rect">
                       <a:avLst/>
@@ -812,16 +790,6 @@
     </w:p>
     <w:p>
       <w:pPr>
-        <w:spacing w:after="60" w:line="300" w:lineRule="auto"/>
-      </w:pPr>
-    </w:p>
-    <w:p>
-      <w:pPr>
-        <w:spacing w:after="60" w:line="300" w:lineRule="auto"/>
-      </w:pPr>
-    </w:p>
-    <w:p>
-      <w:pPr>
         <w:pStyle w:val="Heading1"/>
       </w:pPr>
       <w:r>
@@ -833,7 +801,7 @@
         <w:spacing w:after="120" w:line="320" w:lineRule="auto"/>
       </w:pPr>
       <w:r>
-        <w:t>Dự án gồm 22 trang HTML, chia thành ba nhóm.</w:t>
+        <w:t>Dự án gồm 23 trang HTML, chia thành ba nhóm.</w:t>
       </w:r>
     </w:p>
     <w:p>
@@ -1081,7 +1049,61 @@
                 <w:sz w:val="22"/>
                 <w:szCs w:val="22"/>
               </w:rPr>
-              <w:t>Quên mật khẩu, gửi email đặt lại bằng Supabase</w:t>
+              <w:t>Quên mật khẩu (trang riêng, gửi email đặt lại bằng Supabase)</w:t>
+            </w:r>
+          </w:p>
+        </w:tc>
+      </w:tr>
+      <w:tr>
+        <w:tc>
+          <w:tcPr>
+            <w:tcW w:w="2600" w:type="dxa"/>
+            <w:tcBorders>
+              <w:top w:val="single" w:sz="4" w:space="0" w:color="999999"/>
+              <w:left w:val="single" w:sz="4" w:space="0" w:color="999999"/>
+              <w:bottom w:val="single" w:sz="4" w:space="0" w:color="999999"/>
+              <w:right w:val="single" w:sz="4" w:space="0" w:color="999999"/>
+            </w:tcBorders>
+            <w:tcMar>
+              <w:top w:w="60" w:type="dxa"/>
+              <w:left w:w="100" w:type="dxa"/>
+              <w:bottom w:w="60" w:type="dxa"/>
+              <w:right w:w="100" w:type="dxa"/>
+            </w:tcMar>
+          </w:tcPr>
+          <w:p>
+            <w:r>
+              <w:rPr>
+                <w:sz w:val="22"/>
+                <w:szCs w:val="22"/>
+              </w:rPr>
+              <w:t>Cửa sổ Quên mật khẩu (js/forgot-modal.js)</w:t>
+            </w:r>
+          </w:p>
+        </w:tc>
+        <w:tc>
+          <w:tcPr>
+            <w:tcW w:w="6400" w:type="dxa"/>
+            <w:tcBorders>
+              <w:top w:val="single" w:sz="4" w:space="0" w:color="999999"/>
+              <w:left w:val="single" w:sz="4" w:space="0" w:color="999999"/>
+              <w:bottom w:val="single" w:sz="4" w:space="0" w:color="999999"/>
+              <w:right w:val="single" w:sz="4" w:space="0" w:color="999999"/>
+            </w:tcBorders>
+            <w:tcMar>
+              <w:top w:w="60" w:type="dxa"/>
+              <w:left w:w="100" w:type="dxa"/>
+              <w:bottom w:w="60" w:type="dxa"/>
+              <w:right w:w="100" w:type="dxa"/>
+            </w:tcMar>
+          </w:tcPr>
+          <w:p>
+            <w:r>
+              <w:rPr>
+                <w:sz w:val="22"/>
+                <w:szCs w:val="22"/>
+              </w:rPr>
+              <w:t>Popup ngay trên trang đăng nhập: nhập email, số điện thoại, mật khẩu mới và nhập lại; khớp hồ sơ thì đổi ngay, không cần chuyển trang</w:t>
             </w:r>
           </w:p>
         </w:tc>
@@ -1608,7 +1630,7 @@
                 <w:sz w:val="22"/>
                 <w:szCs w:val="22"/>
               </w:rPr>
-              <w:t>Thông tin tài khoản, ảnh đại diện, đổi mật khẩu</w:t>
+              <w:t>Thông tin tài khoản, ảnh đại diện, đổi mật khẩu, tự cập nhật số điện thoại</w:t>
             </w:r>
           </w:p>
         </w:tc>
@@ -1756,7 +1778,61 @@
                 <w:sz w:val="22"/>
                 <w:szCs w:val="22"/>
               </w:rPr>
-              <w:t>Tổng quan (Dashboard): tổng video, lượt xem, dung lượng, số thành viên, Top 10 video, biểu đồ cột và biểu đồ đường</w:t>
+              <w:t>Tổng quan: danh sách "Bắt đầu quản trị" hướng dẫn admin mới 7 việc theo thứ tự, tự đánh dấu hoàn thành theo dữ liệu thật</w:t>
+            </w:r>
+          </w:p>
+        </w:tc>
+      </w:tr>
+      <w:tr>
+        <w:tc>
+          <w:tcPr>
+            <w:tcW w:w="2600" w:type="dxa"/>
+            <w:tcBorders>
+              <w:top w:val="single" w:sz="4" w:space="0" w:color="999999"/>
+              <w:left w:val="single" w:sz="4" w:space="0" w:color="999999"/>
+              <w:bottom w:val="single" w:sz="4" w:space="0" w:color="999999"/>
+              <w:right w:val="single" w:sz="4" w:space="0" w:color="999999"/>
+            </w:tcBorders>
+            <w:tcMar>
+              <w:top w:w="60" w:type="dxa"/>
+              <w:left w:w="100" w:type="dxa"/>
+              <w:bottom w:w="60" w:type="dxa"/>
+              <w:right w:w="100" w:type="dxa"/>
+            </w:tcMar>
+          </w:tcPr>
+          <w:p>
+            <w:r>
+              <w:rPr>
+                <w:sz w:val="22"/>
+                <w:szCs w:val="22"/>
+              </w:rPr>
+              <w:t>dashboard.html</w:t>
+            </w:r>
+          </w:p>
+        </w:tc>
+        <w:tc>
+          <w:tcPr>
+            <w:tcW w:w="6400" w:type="dxa"/>
+            <w:tcBorders>
+              <w:top w:val="single" w:sz="4" w:space="0" w:color="999999"/>
+              <w:left w:val="single" w:sz="4" w:space="0" w:color="999999"/>
+              <w:bottom w:val="single" w:sz="4" w:space="0" w:color="999999"/>
+              <w:right w:val="single" w:sz="4" w:space="0" w:color="999999"/>
+            </w:tcBorders>
+            <w:tcMar>
+              <w:top w:w="60" w:type="dxa"/>
+              <w:left w:w="100" w:type="dxa"/>
+              <w:bottom w:w="60" w:type="dxa"/>
+              <w:right w:w="100" w:type="dxa"/>
+            </w:tcMar>
+          </w:tcPr>
+          <w:p>
+            <w:r>
+              <w:rPr>
+                <w:sz w:val="22"/>
+                <w:szCs w:val="22"/>
+              </w:rPr>
+              <w:t>Dashboard: tổng video, lượt xem, dung lượng, số thành viên, Top 10 video, biểu đồ cột và biểu đồ đường (tách riêng khỏi trang Tổng quan)</w:t>
             </w:r>
           </w:p>
         </w:tc>
@@ -2221,10 +2297,10 @@
           <w:b/>
           <w:bCs/>
         </w:rPr>
-        <w:t xml:space="preserve">Xác thực và phân quyền: </w:t>
-      </w:r>
-      <w:r>
-        <w:t>đăng ký, đăng nhập, quên/đặt lại mật khẩu, đăng xuất bằng Supabase Auth; kiểm tra session và vai trò ở mọi trang; role chỉ ADMIN được đổi.</w:t>
+        <w:t xml:space="preserve">Quên mật khẩu bằng số điện thoại: </w:t>
+      </w:r>
+      <w:r>
+        <w:t>nhập email + số điện thoại + mật khẩu mới; chỉ đổi khi cả hai khớp hồ sơ thành viên đang hoạt động. Lớp bảo vệ: tài khoản ADMIN không đổi được bằng cách này; sai quá 5 lần trong 1 giờ thì khóa 1 giờ (nhật ký bảng password_reset_attempts, không đọc được từ frontend); sai email hay sai số điện thoại đều trả cùng một kết quả để không lộ email có tồn tại; đổi xong đăng xuất mọi phiên cũ.</w:t>
       </w:r>
     </w:p>
     <w:p>
@@ -2241,10 +2317,10 @@
           <w:b/>
           <w:bCs/>
         </w:rPr>
-        <w:t xml:space="preserve">Kích hoạt thành viên: </w:t>
-      </w:r>
-      <w:r>
-        <w:t>tài khoản mới ở trạng thái PENDING, ADMIN kích hoạt (ACTIVE) hoặc ngừng kích hoạt (INACTIVE); huy hiệu số thành viên chờ ở menu; email tự được xác nhận khi kích hoạt.</w:t>
+        <w:t xml:space="preserve">Cập nhật số điện thoại: </w:t>
+      </w:r>
+      <w:r>
+        <w:t>thành viên tự sửa số điện thoại ở trang Tài khoản (định dạng được kiểm tra ở database, RLS chỉ cho sửa hồ sơ của chính mình).</w:t>
       </w:r>
     </w:p>
     <w:p>
@@ -2261,10 +2337,11 @@
           <w:b/>
           <w:bCs/>
         </w:rPr>
-        <w:t xml:space="preserve">Dashboard: </w:t>
-      </w:r>
-      <w:r>
-        <w:t>thống kê tổng video, lượt xem, dung lượng lưu trữ, số người dùng; biểu đồ cột Top 10 video; biểu đồ đường lượt xem theo ngày/tháng với bộ lọc 7 ngày, 30 ngày, tháng này, năm nay.</w:t>
+        <w:lastRenderedPageBreak/>
+        <w:t xml:space="preserve">Xác thực và phân quyền: </w:t>
+      </w:r>
+      <w:r>
+        <w:t>đăng ký, đăng nhập, quên/đặt lại mật khẩu, đăng xuất bằng Supabase Auth; kiểm tra session và vai trò ở mọi trang; role chỉ ADMIN được đổi.</w:t>
       </w:r>
     </w:p>
     <w:p>
@@ -2281,11 +2358,10 @@
           <w:b/>
           <w:bCs/>
         </w:rPr>
-        <w:lastRenderedPageBreak/>
-        <w:t xml:space="preserve">Quản lý video: </w:t>
-      </w:r>
-      <w:r>
-        <w:t>thêm, sửa, xóa, tìm kiếm, lọc theo danh mục/trạng thái, phân trang; upload ảnh bìa và video (MP4/WEBM) vào Storage hoặc dùng link YouTube hợp lệ.</w:t>
+        <w:t xml:space="preserve">Kích hoạt thành viên: </w:t>
+      </w:r>
+      <w:r>
+        <w:t>tài khoản mới ở trạng thái PENDING, ADMIN kích hoạt (ACTIVE) hoặc ngừng kích hoạt (INACTIVE); huy hiệu số thành viên chờ ở menu; email tự được xác nhận khi kích hoạt.</w:t>
       </w:r>
     </w:p>
     <w:p>
@@ -2302,10 +2378,10 @@
           <w:b/>
           <w:bCs/>
         </w:rPr>
-        <w:t xml:space="preserve">Danh mục video và lĩnh vực khóa học: </w:t>
-      </w:r>
-      <w:r>
-        <w:t>CRUD, slug, bật/tắt hiển thị, sắp xếp thứ tự.</w:t>
+        <w:t xml:space="preserve">Tổng quan và checklist quản trị: </w:t>
+      </w:r>
+      <w:r>
+        <w:t>trang index.html hiển thị 7 bước cho admin mới (tạo lĩnh vực, thêm video, tạo khóa học, thêm chương/bài, xuất bản, kích hoạt thành viên, duyệt đăng ký học); dấu tick tự động theo dữ liệu thật, có thể thu gọn và được nhớ trong trình duyệt. Menu bên trái được gom nhóm lại: Bắt đầu quản trị, Dashboard (Thống kê &amp; biểu đồ), Khóa học, Video, Thành viên, Khám phá.</w:t>
       </w:r>
     </w:p>
     <w:p>
@@ -2322,10 +2398,10 @@
           <w:b/>
           <w:bCs/>
         </w:rPr>
-        <w:t xml:space="preserve">Quản lý khóa học: </w:t>
-      </w:r>
-      <w:r>
-        <w:t>thêm, sửa, xem trước, sao chép (không sao chép video), lưu nháp, xuất bản, ẩn, xóa; giá lưu số nguyên VNĐ; kiểm tra bắt buộc trước khi xuất bản.</w:t>
+        <w:t xml:space="preserve">Dashboard: </w:t>
+      </w:r>
+      <w:r>
+        <w:t>thống kê tổng video, lượt xem, dung lượng lưu trữ, số người dùng; biểu đồ cột Top 10 video; biểu đồ đường lượt xem theo ngày/tháng với bộ lọc 7 ngày, 30 ngày, tháng này, năm nay.</w:t>
       </w:r>
     </w:p>
     <w:p>
@@ -2342,10 +2418,10 @@
           <w:b/>
           <w:bCs/>
         </w:rPr>
-        <w:t xml:space="preserve">Chương trình học: </w:t>
-      </w:r>
-      <w:r>
-        <w:t>thêm/sửa/xóa chương và bài học, sắp xếp, chuyển bài giữa các chương, đánh dấu học thử; chọn video từ kho hiện có (một video dùng được cho nhiều khóa học).</w:t>
+        <w:t xml:space="preserve">Quản lý video: </w:t>
+      </w:r>
+      <w:r>
+        <w:t>thêm, sửa, xóa, tìm kiếm, lọc theo danh mục/trạng thái, phân trang; upload ảnh bìa và video (MP4/WEBM) vào Storage hoặc dùng link YouTube hợp lệ.</w:t>
       </w:r>
     </w:p>
     <w:p>
@@ -2362,10 +2438,10 @@
           <w:b/>
           <w:bCs/>
         </w:rPr>
-        <w:t xml:space="preserve">Catalog công khai: </w:t>
-      </w:r>
-      <w:r>
-        <w:t>khách xem khóa học đã xuất bản; bản nháp không lộ ra.</w:t>
+        <w:t xml:space="preserve">Danh mục video và lĩnh vực khóa học: </w:t>
+      </w:r>
+      <w:r>
+        <w:t>CRUD, slug, bật/tắt hiển thị, sắp xếp thứ tự.</w:t>
       </w:r>
     </w:p>
     <w:p>
@@ -2382,10 +2458,10 @@
           <w:b/>
           <w:bCs/>
         </w:rPr>
-        <w:t xml:space="preserve">Đăng ký học: </w:t>
-      </w:r>
-      <w:r>
-        <w:t>thành viên bấm Đăng ký (dùng số điện thoại trong hồ sơ), ADMIN kích hoạt/từ chối/thu hồi.</w:t>
+        <w:t xml:space="preserve">Quản lý khóa học: </w:t>
+      </w:r>
+      <w:r>
+        <w:t>thêm, sửa, xem trước, sao chép (không sao chép video), lưu nháp, xuất bản, ẩn, xóa; giá lưu số nguyên VNĐ; kiểm tra bắt buộc trước khi xuất bản.</w:t>
       </w:r>
     </w:p>
     <w:p>
@@ -2402,10 +2478,10 @@
           <w:b/>
           <w:bCs/>
         </w:rPr>
-        <w:t xml:space="preserve">Học và tiến độ: </w:t>
-      </w:r>
-      <w:r>
-        <w:t>màn hình học theo chương/bài, lưu tiến độ, trang Khóa học của tôi.</w:t>
+        <w:t xml:space="preserve">Chương trình học: </w:t>
+      </w:r>
+      <w:r>
+        <w:t>thêm/sửa/xóa chương và bài học, sắp xếp, chuyển bài giữa các chương, đánh dấu học thử; chọn video từ kho hiện có (một video dùng được cho nhiều khóa học).</w:t>
       </w:r>
     </w:p>
     <w:p>
@@ -2422,10 +2498,10 @@
           <w:b/>
           <w:bCs/>
         </w:rPr>
-        <w:t xml:space="preserve">Thông báo: </w:t>
-      </w:r>
-      <w:r>
-        <w:t>tự tạo khi ADMIN kích hoạt, từ chối hoặc thu hồi đăng ký, kèm lời nhắn.</w:t>
+        <w:t xml:space="preserve">Catalog công khai: </w:t>
+      </w:r>
+      <w:r>
+        <w:t>khách xem khóa học đã xuất bản; bản nháp không lộ ra.</w:t>
       </w:r>
     </w:p>
     <w:p>
@@ -2442,10 +2518,10 @@
           <w:b/>
           <w:bCs/>
         </w:rPr>
-        <w:t xml:space="preserve">Theo dõi lượt xem: </w:t>
-      </w:r>
-      <w:r>
-        <w:t>ghi mỗi lượt mở video; cùng video chỉ tính một lần trong 30 phút trên mỗi trình duyệt.</w:t>
+        <w:t xml:space="preserve">Đăng ký học: </w:t>
+      </w:r>
+      <w:r>
+        <w:t>thành viên bấm Đăng ký (dùng số điện thoại trong hồ sơ), ADMIN kích hoạt/từ chối/thu hồi.</w:t>
       </w:r>
     </w:p>
     <w:p>
@@ -2462,10 +2538,10 @@
           <w:b/>
           <w:bCs/>
         </w:rPr>
-        <w:t xml:space="preserve">Bảo mật: </w:t>
-      </w:r>
-      <w:r>
-        <w:t>RLS toàn bộ bảng, Storage policy, video khóa học không lộ cho người chưa được kích hoạt, video đã gắn vào bài học không thể xóa, hiển thị dữ liệu bằng textContent chống XSS, CSP, không hiện lỗi hệ thống cho người dùng.</w:t>
+        <w:t xml:space="preserve">Học và tiến độ: </w:t>
+      </w:r>
+      <w:r>
+        <w:t>màn hình học theo chương/bài, lưu tiến độ, trang Khóa học của tôi.</w:t>
       </w:r>
     </w:p>
     <w:p>
@@ -2482,6 +2558,67 @@
           <w:b/>
           <w:bCs/>
         </w:rPr>
+        <w:t xml:space="preserve">Thông báo: </w:t>
+      </w:r>
+      <w:r>
+        <w:t>tự tạo khi ADMIN kích hoạt, từ chối hoặc thu hồi đăng ký, kèm lời nhắn.</w:t>
+      </w:r>
+    </w:p>
+    <w:p>
+      <w:pPr>
+        <w:pStyle w:val="ListParagraph"/>
+        <w:numPr>
+          <w:ilvl w:val="0"/>
+          <w:numId w:val="2"/>
+        </w:numPr>
+        <w:spacing w:after="60" w:line="300" w:lineRule="auto"/>
+      </w:pPr>
+      <w:r>
+        <w:rPr>
+          <w:b/>
+          <w:bCs/>
+        </w:rPr>
+        <w:t xml:space="preserve">Theo dõi lượt xem: </w:t>
+      </w:r>
+      <w:r>
+        <w:t>ghi mỗi lượt mở video; cùng video chỉ tính một lần trong 30 phút trên mỗi trình duyệt.</w:t>
+      </w:r>
+    </w:p>
+    <w:p>
+      <w:pPr>
+        <w:pStyle w:val="ListParagraph"/>
+        <w:numPr>
+          <w:ilvl w:val="0"/>
+          <w:numId w:val="2"/>
+        </w:numPr>
+        <w:spacing w:after="60" w:line="300" w:lineRule="auto"/>
+      </w:pPr>
+      <w:r>
+        <w:rPr>
+          <w:b/>
+          <w:bCs/>
+        </w:rPr>
+        <w:lastRenderedPageBreak/>
+        <w:t xml:space="preserve">Bảo mật: </w:t>
+      </w:r>
+      <w:r>
+        <w:t>RLS toàn bộ bảng, Storage policy, video khóa học không lộ cho người chưa được kích hoạt, video đã gắn vào bài học không thể xóa, hiển thị dữ liệu bằng textContent chống XSS, CSP, không hiện lỗi hệ thống cho người dùng.</w:t>
+      </w:r>
+    </w:p>
+    <w:p>
+      <w:pPr>
+        <w:pStyle w:val="ListParagraph"/>
+        <w:numPr>
+          <w:ilvl w:val="0"/>
+          <w:numId w:val="2"/>
+        </w:numPr>
+        <w:spacing w:after="60" w:line="300" w:lineRule="auto"/>
+      </w:pPr>
+      <w:r>
+        <w:rPr>
+          <w:b/>
+          <w:bCs/>
+        </w:rPr>
         <w:t xml:space="preserve">Giao diện: </w:t>
       </w:r>
       <w:r>
@@ -2501,7 +2638,7 @@
         <w:spacing w:after="120" w:line="320" w:lineRule="auto"/>
       </w:pPr>
       <w:r>
-        <w:t>Cơ sở dữ liệu PostgreSQL trên Supabase được xây dựng bằng 16 file migration chạy lại an toàn nhiều lần:</w:t>
+        <w:t>Cơ sở dữ liệu PostgreSQL trên Supabase được xây dựng bằng 18 file migration chạy lại an toàn nhiều lần:</w:t>
       </w:r>
     </w:p>
     <w:tbl>
@@ -2518,8 +2655,8 @@
         <w:tblLook w:val="04A0" w:firstRow="1" w:lastRow="0" w:firstColumn="1" w:lastColumn="0" w:noHBand="0" w:noVBand="1"/>
       </w:tblPr>
       <w:tblGrid>
-        <w:gridCol w:w="2900"/>
-        <w:gridCol w:w="6100"/>
+        <w:gridCol w:w="3176"/>
+        <w:gridCol w:w="5824"/>
       </w:tblGrid>
       <w:tr>
         <w:trPr>
@@ -2785,7 +2922,6 @@
                 <w:sz w:val="22"/>
                 <w:szCs w:val="22"/>
               </w:rPr>
-              <w:lastRenderedPageBreak/>
               <w:t>04_videos_storage.sql</w:t>
             </w:r>
           </w:p>
@@ -3474,6 +3610,114 @@
           </w:p>
         </w:tc>
       </w:tr>
+      <w:tr>
+        <w:tc>
+          <w:tcPr>
+            <w:tcW w:w="2900" w:type="dxa"/>
+            <w:tcBorders>
+              <w:top w:val="single" w:sz="4" w:space="0" w:color="999999"/>
+              <w:left w:val="single" w:sz="4" w:space="0" w:color="999999"/>
+              <w:bottom w:val="single" w:sz="4" w:space="0" w:color="999999"/>
+              <w:right w:val="single" w:sz="4" w:space="0" w:color="999999"/>
+            </w:tcBorders>
+            <w:tcMar>
+              <w:top w:w="60" w:type="dxa"/>
+              <w:left w:w="100" w:type="dxa"/>
+              <w:bottom w:w="60" w:type="dxa"/>
+              <w:right w:w="100" w:type="dxa"/>
+            </w:tcMar>
+          </w:tcPr>
+          <w:p>
+            <w:r>
+              <w:rPr>
+                <w:sz w:val="22"/>
+                <w:szCs w:val="22"/>
+              </w:rPr>
+              <w:t>17_profile_phone_edit.sql</w:t>
+            </w:r>
+          </w:p>
+        </w:tc>
+        <w:tc>
+          <w:tcPr>
+            <w:tcW w:w="6100" w:type="dxa"/>
+            <w:tcBorders>
+              <w:top w:val="single" w:sz="4" w:space="0" w:color="999999"/>
+              <w:left w:val="single" w:sz="4" w:space="0" w:color="999999"/>
+              <w:bottom w:val="single" w:sz="4" w:space="0" w:color="999999"/>
+              <w:right w:val="single" w:sz="4" w:space="0" w:color="999999"/>
+            </w:tcBorders>
+            <w:tcMar>
+              <w:top w:w="60" w:type="dxa"/>
+              <w:left w:w="100" w:type="dxa"/>
+              <w:bottom w:w="60" w:type="dxa"/>
+              <w:right w:w="100" w:type="dxa"/>
+            </w:tcMar>
+          </w:tcPr>
+          <w:p>
+            <w:r>
+              <w:rPr>
+                <w:sz w:val="22"/>
+                <w:szCs w:val="22"/>
+              </w:rPr>
+              <w:t>Cho thành viên tự cập nhật cột phone trong hồ sơ</w:t>
+            </w:r>
+          </w:p>
+        </w:tc>
+      </w:tr>
+      <w:tr>
+        <w:tc>
+          <w:tcPr>
+            <w:tcW w:w="2900" w:type="dxa"/>
+            <w:tcBorders>
+              <w:top w:val="single" w:sz="4" w:space="0" w:color="999999"/>
+              <w:left w:val="single" w:sz="4" w:space="0" w:color="999999"/>
+              <w:bottom w:val="single" w:sz="4" w:space="0" w:color="999999"/>
+              <w:right w:val="single" w:sz="4" w:space="0" w:color="999999"/>
+            </w:tcBorders>
+            <w:tcMar>
+              <w:top w:w="60" w:type="dxa"/>
+              <w:left w:w="100" w:type="dxa"/>
+              <w:bottom w:w="60" w:type="dxa"/>
+              <w:right w:w="100" w:type="dxa"/>
+            </w:tcMar>
+          </w:tcPr>
+          <w:p>
+            <w:r>
+              <w:rPr>
+                <w:sz w:val="22"/>
+                <w:szCs w:val="22"/>
+              </w:rPr>
+              <w:t>18_reset_password_by_phone.sql</w:t>
+            </w:r>
+          </w:p>
+        </w:tc>
+        <w:tc>
+          <w:tcPr>
+            <w:tcW w:w="6100" w:type="dxa"/>
+            <w:tcBorders>
+              <w:top w:val="single" w:sz="4" w:space="0" w:color="999999"/>
+              <w:left w:val="single" w:sz="4" w:space="0" w:color="999999"/>
+              <w:bottom w:val="single" w:sz="4" w:space="0" w:color="999999"/>
+              <w:right w:val="single" w:sz="4" w:space="0" w:color="999999"/>
+            </w:tcBorders>
+            <w:tcMar>
+              <w:top w:w="60" w:type="dxa"/>
+              <w:left w:w="100" w:type="dxa"/>
+              <w:bottom w:w="60" w:type="dxa"/>
+              <w:right w:w="100" w:type="dxa"/>
+            </w:tcMar>
+          </w:tcPr>
+          <w:p>
+            <w:r>
+              <w:rPr>
+                <w:sz w:val="22"/>
+                <w:szCs w:val="22"/>
+              </w:rPr>
+              <w:t>Hàm reset_password_with_phone, bảng password_reset_attempts, giới hạn số lần thử</w:t>
+            </w:r>
+          </w:p>
+        </w:tc>
+      </w:tr>
     </w:tbl>
     <w:p>
       <w:pPr>
@@ -3485,6 +3729,7 @@
         <w:pStyle w:val="Heading1"/>
       </w:pPr>
       <w:r>
+        <w:lastRenderedPageBreak/>
         <w:t>4. Các file .md và chức năng của file</w:t>
       </w:r>
     </w:p>
@@ -3977,7 +4222,6 @@
                 <w:sz w:val="22"/>
                 <w:szCs w:val="22"/>
               </w:rPr>
-              <w:lastRenderedPageBreak/>
               <w:t>08_SUPABASE_STORAGE.md</w:t>
             </w:r>
           </w:p>
@@ -4256,6 +4500,7 @@
         <w:pStyle w:val="Heading1"/>
       </w:pPr>
       <w:r>
+        <w:lastRenderedPageBreak/>
         <w:t>5. Thứ tự các prompt và kết quả</w:t>
       </w:r>
     </w:p>
@@ -4264,7 +4509,7 @@
         <w:spacing w:after="120" w:line="320" w:lineRule="auto"/>
       </w:pPr>
       <w:r>
-        <w:t>Dự án được xây dựng theo nguyên tắc “làm từng giai đoạn, dừng lại để kiểm tra rồi mới làm tiếp”. Prompt 1, 3 và 4 có nội dung gốc trong thư mục dự án; các prompt còn lại được tóm tắt theo kết quả thể hiện trong mã nguồn và các file migration.</w:t>
+        <w:t>Dự án được xây dựng theo nguyên tắc “làm từng giai đoạn, dừng lại để kiểm tra rồi mới làm tiếp”. Prompt 1, 4 và 10 có nội dung gốc trong thư mục dự án; các prompt còn lại được tóm tắt theo kết quả thể hiện trong mã nguồn và các file migration.</w:t>
       </w:r>
     </w:p>
     <w:p>
@@ -4312,8 +4557,56 @@
         <w:spacing w:after="120" w:line="320" w:lineRule="auto"/>
       </w:pPr>
       <w:r>
+        <w:t>Kết quả: dựng cấu trúc thư mục (css, js, database, assets), trang đăng nhập/đăng ký/quên mật khẩu, bố cục quản trị, Dashboard, quản lý video, thành viên, danh mục; SQL 01–07 và dữ liệu mẫu; bucket Storage; RLS. Tài khoản admin1 và user1 hoạt động.</w:t>
+      </w:r>
+    </w:p>
+    <w:p>
+      <w:pPr>
+        <w:pStyle w:val="Heading2"/>
+      </w:pPr>
+      <w:r>
+        <w:t>Prompt 3 – Video từ YouTube</w:t>
+      </w:r>
+    </w:p>
+    <w:p>
+      <w:pPr>
+        <w:spacing w:after="120" w:line="320" w:lineRule="auto"/>
+      </w:pPr>
+      <w:r>
+        <w:t>Nội dung (tóm tắt): bổ sung khả năng dùng link YouTube thay cho upload file để tiết kiệm dung lượng.</w:t>
+      </w:r>
+    </w:p>
+    <w:p>
+      <w:pPr>
+        <w:spacing w:after="120" w:line="320" w:lineRule="auto"/>
+      </w:pPr>
+      <w:r>
+        <w:t>Kết quả: file 08_youtube.sql, cột video_source (UPLOAD/YOUTUBE), kiểm tra domain YouTube, nhúng bằng youtube-nocookie.com, tự lấy ảnh bìa; thêm trang library.html và watch.html cho thành viên.</w:t>
+      </w:r>
+    </w:p>
+    <w:p>
+      <w:pPr>
+        <w:pStyle w:val="Heading2"/>
+      </w:pPr>
+      <w:r>
+        <w:t>Prompt 4 – Nâng cấp thành hệ thống khóa học (master_admin.txt)</w:t>
+      </w:r>
+    </w:p>
+    <w:p>
+      <w:pPr>
+        <w:spacing w:after="120" w:line="320" w:lineRule="auto"/>
+      </w:pPr>
+      <w:r>
+        <w:t>Nội dung: vai trò Senior Full-stack/Supabase; nâng cấp Video_Admin thành hệ thống ADMIN quản lý khóa học; không xóa dữ liệu cũ, tái sử dụng kho video; 7 giai đoạn (phân tích, database, lĩnh vực, khóa học, chương và bài học, trang khách, kiểm thử); sau mỗi giai đoạn dừng chờ xác nhận.</w:t>
+      </w:r>
+    </w:p>
+    <w:p>
+      <w:pPr>
+        <w:spacing w:after="120" w:line="320" w:lineRule="auto"/>
+      </w:pPr>
+      <w:r>
         <w:lastRenderedPageBreak/>
-        <w:t>Kết quả: dựng cấu trúc thư mục (css, js, database, assets), trang đăng nhập/đăng ký/quên mật khẩu, bố cục quản trị, Dashboard, quản lý video, thành viên, danh mục; SQL 01–07 và dữ liệu mẫu; bucket Storage; RLS. Tài khoản admin1 và user1 hoạt động.</w:t>
+        <w:t>Kết quả: giai đoạn 1 là bản phân tích kiến trúc; sau khi duyệt, tạo 09_courses.sql và các trang course-categories, courses, course-edit (4 tab), course-catalog, course-detail, bộ chọn video từ kho; bản sao khóa học; xuất bản/ẩn/nháp.</w:t>
       </w:r>
     </w:p>
     <w:p>
@@ -4321,7 +4614,7 @@
         <w:pStyle w:val="Heading2"/>
       </w:pPr>
       <w:r>
-        <w:t>Prompt 3 – Video từ YouTube</w:t>
+        <w:t>Prompt 5 – Đăng ký học, học và thông báo</w:t>
       </w:r>
     </w:p>
     <w:p>
@@ -4329,7 +4622,7 @@
         <w:spacing w:after="120" w:line="320" w:lineRule="auto"/>
       </w:pPr>
       <w:r>
-        <w:t>Nội dung (tóm tắt): bổ sung khả năng dùng link YouTube thay cho upload file để tiết kiệm dung lượng.</w:t>
+        <w:t>Nội dung (tóm tắt): thêm luồng khách quan tâm khóa học → thành viên đăng ký → ADMIN kích hoạt; thành viên học và theo dõi tiến độ; thông báo; không để lộ video trả phí.</w:t>
       </w:r>
     </w:p>
     <w:p>
@@ -4337,7 +4630,7 @@
         <w:spacing w:after="120" w:line="320" w:lineRule="auto"/>
       </w:pPr>
       <w:r>
-        <w:t>Kết quả: file 08_youtube.sql, cột video_source (UPLOAD/YOUTUBE), kiểm tra domain YouTube, nhúng bằng youtube-nocookie.com, tự lấy ảnh bìa; thêm trang library.html và watch.html cho thành viên.</w:t>
+        <w:t>Kết quả: 10_enrollments.sql, 11_notifications.sql, 12_clear_activation_note.sql, 13_protect_course_videos.sql; trang enrollments.html, my-courses.html, learn.html; chuông thông báo; thay policy video để video khóa học chỉ mở cho người đã được kích hoạt.</w:t>
       </w:r>
     </w:p>
     <w:p>
@@ -4345,7 +4638,7 @@
         <w:pStyle w:val="Heading2"/>
       </w:pPr>
       <w:r>
-        <w:t>Prompt 4 – Nâng cấp thành hệ thống khóa học (master_admin.txt)</w:t>
+        <w:t>Prompt 6 – Đổi thương hiệu Học Vèo và thiết kế lại giao diện</w:t>
       </w:r>
     </w:p>
     <w:p>
@@ -4353,7 +4646,7 @@
         <w:spacing w:after="120" w:line="320" w:lineRule="auto"/>
       </w:pPr>
       <w:r>
-        <w:t>Nội dung: vai trò Senior Full-stack/Supabase; nâng cấp Video_Admin thành hệ thống ADMIN quản lý khóa học; không xóa dữ liệu cũ, tái sử dụng kho video; 7 giai đoạn (phân tích, database, lĩnh vực, khóa học, chương và bài học, trang khách, kiểm thử); sau mỗi giai đoạn dừng chờ xác nhận.</w:t>
+        <w:t>Nội dung (tóm tắt): đặt tên Học Vèo, slogan, logo; vai trò Senior UI/UX; thống nhất màu Cam #F97316 và Navy #172554; đạt WCAG AA; chỉ ghi nội dung có thật; không lạm dụng gradient và animation.</w:t>
       </w:r>
     </w:p>
     <w:p>
@@ -4361,7 +4654,15 @@
         <w:spacing w:after="120" w:line="320" w:lineRule="auto"/>
       </w:pPr>
       <w:r>
-        <w:t>Kết quả: giai đoạn 1 là bản phân tích kiến trúc; sau khi duyệt, tạo 09_courses.sql và các trang course-categories, courses, course-edit (4 tab), course-catalog, course-detail, bộ chọn video từ kho; bản sao khóa học; xuất bản/ẩn/nháp.</w:t>
+        <w:t xml:space="preserve">Kết quả: hệ màu duy nhất </w:t>
+      </w:r>
+      <w:proofErr w:type="gramStart"/>
+      <w:r>
+        <w:t>trong :root</w:t>
+      </w:r>
+      <w:proofErr w:type="gramEnd"/>
+      <w:r>
+        <w:t xml:space="preserve"> của style.css; landing/hero có minh họa; phông Be Vietnam Pro tự host; các file landing.css, courses.css, auth.css, learning.css, responsive.css; icon phân loại cho các lĩnh vực.</w:t>
       </w:r>
     </w:p>
     <w:p>
@@ -4369,7 +4670,7 @@
         <w:pStyle w:val="Heading2"/>
       </w:pPr>
       <w:r>
-        <w:t>Prompt 5 – Đăng ký học, học và thông báo</w:t>
+        <w:t>Prompt 7 – Hoàn thiện quản lý thành viên</w:t>
       </w:r>
     </w:p>
     <w:p>
@@ -4377,7 +4678,7 @@
         <w:spacing w:after="120" w:line="320" w:lineRule="auto"/>
       </w:pPr>
       <w:r>
-        <w:t>Nội dung (tóm tắt): thêm luồng khách quan tâm khóa học → thành viên đăng ký → ADMIN kích hoạt; thành viên học và theo dõi tiến độ; thông báo; không để lộ video trả phí.</w:t>
+        <w:t>Nội dung (tóm tắt): thành viên đăng ký phải chờ ADMIN kích hoạt; thêm số điện thoại; nút Đăng ký khóa học không cần popup; cho phép trùng tên đăng nhập nhưng không trùng email.</w:t>
       </w:r>
     </w:p>
     <w:p>
@@ -4385,7 +4686,15 @@
         <w:spacing w:after="120" w:line="320" w:lineRule="auto"/>
       </w:pPr>
       <w:r>
-        <w:t>Kết quả: 10_enrollments.sql, 11_notifications.sql, 12_clear_activation_note.sql, 13_protect_course_videos.sql; trang enrollments.html, my-courses.html, learn.html; chuông thông báo; thay policy video để video khóa học chỉ mở cho người đã được kích hoạt.</w:t>
+        <w:t xml:space="preserve">Kết quả: 14_member_activation.sql, 15_member_phone.sql, 16_username_duplicate.sql; nút Kích hoạt/Ngừng kích hoạt ở trang Thành viên; trang đăng ký báo “Email đã được sử dụng”; công cụ tools/set-asset-version.ps1 gắn phiên </w:t>
+      </w:r>
+      <w:proofErr w:type="gramStart"/>
+      <w:r>
+        <w:t>bản ?v</w:t>
+      </w:r>
+      <w:proofErr w:type="gramEnd"/>
+      <w:r>
+        <w:t>= để tránh trình duyệt dùng file cũ.</w:t>
       </w:r>
     </w:p>
     <w:p>
@@ -4393,7 +4702,7 @@
         <w:pStyle w:val="Heading2"/>
       </w:pPr>
       <w:r>
-        <w:t>Prompt 6 – Đổi thương hiệu Học Vèo và thiết kế lại giao diện</w:t>
+        <w:t>Prompt 8 – Cập nhật hồ sơ và quên mật khẩu bằng số điện thoại</w:t>
       </w:r>
     </w:p>
     <w:p>
@@ -4401,7 +4710,7 @@
         <w:spacing w:after="120" w:line="320" w:lineRule="auto"/>
       </w:pPr>
       <w:r>
-        <w:t>Nội dung (tóm tắt): đặt tên Học Vèo, slogan, logo; vai trò Senior UI/UX; thống nhất màu Cam #F97316 và Navy #172554; đạt WCAG AA; chỉ ghi nội dung có thật; không lạm dụng gradient và animation.</w:t>
+        <w:t>Nội dung (tóm tắt): thành viên tự sửa số điện thoại; quên mật khẩu thì nhập email và số điện thoại để đặt mật khẩu mới ngay trên popup đăng nhập, không phải chờ email.</w:t>
       </w:r>
     </w:p>
     <w:p>
@@ -4409,16 +4718,11 @@
         <w:spacing w:after="120" w:line="320" w:lineRule="auto"/>
       </w:pPr>
       <w:r>
+        <w:t xml:space="preserve">Kết quả: 17_profile_phone_edit.sql, 18_reset_password_by_phone.sql; js/forgot-modal.js; sửa account.js, auth.js, login-modal.js, auth.css; có khóa sau 5 lần sai và </w:t>
+      </w:r>
+      <w:r>
         <w:lastRenderedPageBreak/>
-        <w:t xml:space="preserve">Kết quả: hệ màu duy nhất </w:t>
-      </w:r>
-      <w:proofErr w:type="gramStart"/>
-      <w:r>
-        <w:t>trong :root</w:t>
-      </w:r>
-      <w:proofErr w:type="gramEnd"/>
-      <w:r>
-        <w:t xml:space="preserve"> của style.css; landing/hero có minh họa; phông Be Vietnam Pro tự host; các file landing.css, courses.css, auth.css, learning.css, responsive.css; icon phân loại cho các lĩnh vực.</w:t>
+        <w:t>chặn tài khoản ADMIN. Rủi ro cần lưu ý: số điện thoại dễ đoán hơn mật khẩu nên đây là phương án tiện lợi cho đồ án, khi triển khai thật nên dùng OTP hoặc email.</w:t>
       </w:r>
     </w:p>
     <w:p>
@@ -4426,7 +4730,7 @@
         <w:pStyle w:val="Heading2"/>
       </w:pPr>
       <w:r>
-        <w:t>Prompt 7 – Hoàn thiện quản lý thành viên</w:t>
+        <w:t>Prompt 9 – Tách Tổng quan và Dashboard, thêm checklist cho admin</w:t>
       </w:r>
     </w:p>
     <w:p>
@@ -4434,7 +4738,7 @@
         <w:spacing w:after="120" w:line="320" w:lineRule="auto"/>
       </w:pPr>
       <w:r>
-        <w:t>Nội dung (tóm tắt): thành viên đăng ký phải chờ ADMIN kích hoạt; thêm số điện thoại; nút Đăng ký khóa học không cần popup; cho phép trùng tên đăng nhập nhưng không trùng email.</w:t>
+        <w:t>Nội dung (tóm tắt): trang đầu của admin cần hướng dẫn việc phải làm; tách thống kê sang trang riêng; thống nhất lại menu và giao diện.</w:t>
       </w:r>
     </w:p>
     <w:p>
@@ -4442,15 +4746,31 @@
         <w:spacing w:after="120" w:line="320" w:lineRule="auto"/>
       </w:pPr>
       <w:r>
-        <w:t xml:space="preserve">Kết quả: 14_member_activation.sql, 15_member_phone.sql, 16_username_duplicate.sql; nút Kích hoạt/Ngừng kích hoạt ở trang Thành viên; trang đăng ký báo “Email đã được sử dụng”; công cụ tools/set-asset-version.ps1 gắn phiên </w:t>
-      </w:r>
-      <w:proofErr w:type="gramStart"/>
-      <w:r>
-        <w:t>bản ?v</w:t>
-      </w:r>
-      <w:proofErr w:type="gramEnd"/>
-      <w:r>
-        <w:t>= để tránh trình duyệt dùng file cũ.</w:t>
+        <w:t>Kết quả: index.html thành trang Tổng quan với js/overview.js và js/admin-checklist.js; dashboard.html + dashboard.js giữ thống kê và biểu đồ; menu gom nhóm trong layout.js; thêm favicon và logo biểu tượng; chỉnh style.css, courses.css, landing.css, components.js; chạy tools/set-asset-version.ps1 để gắn phiên bản mới cho mọi file.</w:t>
+      </w:r>
+    </w:p>
+    <w:p>
+      <w:pPr>
+        <w:pStyle w:val="Heading2"/>
+      </w:pPr>
+      <w:r>
+        <w:t>Prompt 10 – Viết và cập nhật báo cáo</w:t>
+      </w:r>
+    </w:p>
+    <w:p>
+      <w:pPr>
+        <w:spacing w:after="120" w:line="320" w:lineRule="auto"/>
+      </w:pPr>
+      <w:r>
+        <w:t>Nội dung: viết báo cáo đồ án Học Vèo theo năm mục (mô tả dự án, các trang, chức năng, file .md, thứ tự prompt và kết quả), sau đó bổ sung các phần mới sửa.</w:t>
+      </w:r>
+    </w:p>
+    <w:p>
+      <w:pPr>
+        <w:spacing w:after="120" w:line="320" w:lineRule="auto"/>
+      </w:pPr>
+      <w:r>
+        <w:t>Kết quả: tài liệu báo cáo này (đã cập nhật đến ngày 18/10/2026).</w:t>
       </w:r>
     </w:p>
     <w:p>
@@ -4500,7 +4820,7 @@
         <w:spacing w:after="60" w:line="300" w:lineRule="auto"/>
       </w:pPr>
       <w:r>
-        <w:t>Nên tắt Confirm email trên Supabase để tránh giới hạn gửi email mặc định.</w:t>
+        <w:t>Quên mật khẩu bằng số điện thoại chỉ phù hợp mức đồ án; bản triển khai thật nên chuyển sang OTP/email.</w:t>
       </w:r>
     </w:p>
     <w:p>
@@ -4513,11 +4833,24 @@
         <w:spacing w:after="60" w:line="300" w:lineRule="auto"/>
       </w:pPr>
       <w:r>
+        <w:t>Nên tắt Confirm email trên Supabase để tránh giới hạn gửi email mặc định.</w:t>
+      </w:r>
+    </w:p>
+    <w:p>
+      <w:pPr>
+        <w:pStyle w:val="ListParagraph"/>
+        <w:numPr>
+          <w:ilvl w:val="0"/>
+          <w:numId w:val="2"/>
+        </w:numPr>
+        <w:spacing w:after="60" w:line="300" w:lineRule="auto"/>
+      </w:pPr>
+      <w:r>
         <w:t>Có thể bổ sung bài kiểm tra, chứng chỉ, đánh giá khóa học và hệ thống affiliate.</w:t>
       </w:r>
     </w:p>
     <w:sectPr>
-      <w:footerReference w:type="default" r:id="rId10"/>
+      <w:footerReference w:type="default" r:id="rId8"/>
       <w:pgSz w:w="11906" w:h="16838"/>
       <w:pgMar w:top="1440" w:right="1440" w:bottom="1440" w:left="1440" w:header="708" w:footer="708" w:gutter="0"/>
       <w:cols w:space="720"/>
@@ -4614,9 +4947,9 @@
 <file path=word/numbering.xml><?xml version="1.0" encoding="utf-8"?>
 <w:numbering xmlns:wpc="http://schemas.microsoft.com/office/word/2010/wordprocessingCanvas" xmlns:cx="http://schemas.microsoft.com/office/drawing/2014/chartex" xmlns:cx1="http://schemas.microsoft.com/office/drawing/2015/9/8/chartex" xmlns:cx2="http://schemas.microsoft.com/office/drawing/2015/10/21/chartex" xmlns:cx3="http://schemas.microsoft.com/office/drawing/2016/5/9/chartex" xmlns:cx4="http://schemas.microsoft.com/office/drawing/2016/5/10/chartex" xmlns:cx5="http://schemas.microsoft.com/office/drawing/2016/5/11/chartex" xmlns:cx6="http://schemas.microsoft.com/office/drawing/2016/5/12/chartex" xmlns:cx7="http://schemas.microsoft.com/office/drawing/2016/5/13/chartex" xmlns:cx8="http://schemas.microsoft.com/office/drawing/2016/5/14/chartex" xmlns:mc="http://schemas.openxmlformats.org/markup-compatibility/2006" xmlns:aink="http://schemas.microsoft.com/office/drawing/2016/ink" xmlns:am3d="http://schemas.microsoft.com/office/drawing/2017/model3d" xmlns:o="urn:schemas-microsoft-com:office:office" xmlns:r="http://schemas.openxmlformats.org/officeDocument/2006/relationships" xmlns:m="http://schemas.openxmlformats.org/officeDocument/2006/math" xmlns:v="urn:schemas-microsoft-com:vml" xmlns:wp14="http://schemas.microsoft.com/office/word/2010/wordprocessingDrawing" xmlns:wp="http://schemas.openxmlformats.org/drawingml/2006/wordprocessingDrawing" xmlns:w10="urn:schemas-microsoft-com:office:word" xmlns:w="http://schemas.openxmlformats.org/wordprocessingml/2006/main" xmlns:w14="http://schemas.microsoft.com/office/word/2010/wordml" xmlns:w15="http://schemas.microsoft.com/office/word/2012/wordml" xmlns:w16cid="http://schemas.microsoft.com/office/word/2016/wordml/cid" xmlns:w16se="http://schemas.microsoft.com/office/word/2015/wordml/symex" xmlns:wpg="http://schemas.microsoft.com/office/word/2010/wordprocessingGroup" xmlns:wpi="http://schemas.microsoft.com/office/word/2010/wordprocessingInk" xmlns:wne="http://schemas.microsoft.com/office/word/2006/wordml" xmlns:wps="http://schemas.microsoft.com/office/word/2010/wordprocessingShape" mc:Ignorable="w14 w15 w16se w16cid wp14">
   <w:abstractNum w:abstractNumId="0" w15:restartNumberingAfterBreak="0">
-    <w:nsid w:val="385B4A24"/>
+    <w:nsid w:val="06B153ED"/>
     <w:multiLevelType w:val="hybridMultilevel"/>
-    <w:tmpl w:val="0A00EC06"/>
+    <w:tmpl w:val="B16AA396"/>
     <w:lvl w:ilvl="0" w:tplc="0409000F">
       <w:start w:val="1"/>
       <w:numFmt w:val="decimal"/>
@@ -4703,10 +5036,10 @@
     </w:lvl>
   </w:abstractNum>
   <w:abstractNum w:abstractNumId="1" w15:restartNumberingAfterBreak="0">
-    <w:nsid w:val="39DD114E"/>
+    <w:nsid w:val="4E705666"/>
     <w:multiLevelType w:val="hybridMultilevel"/>
-    <w:tmpl w:val="1D0492AA"/>
-    <w:lvl w:ilvl="0" w:tplc="FC887C7C" w:tentative="1">
+    <w:tmpl w:val="90CE95D0"/>
+    <w:lvl w:ilvl="0" w:tplc="EAA0AADA" w:tentative="1">
       <w:start w:val="1"/>
       <w:numFmt w:val="bullet"/>
       <w:lvlText w:val="●"/>
@@ -4715,7 +5048,7 @@
         <w:ind w:left="720" w:hanging="360"/>
       </w:pPr>
     </w:lvl>
-    <w:lvl w:ilvl="1" w:tplc="04942316" w:tentative="1">
+    <w:lvl w:ilvl="1" w:tplc="094C1E0C" w:tentative="1">
       <w:start w:val="1"/>
       <w:numFmt w:val="bullet"/>
       <w:lvlText w:val="○"/>
@@ -4724,7 +5057,7 @@
         <w:ind w:left="1440" w:hanging="360"/>
       </w:pPr>
     </w:lvl>
-    <w:lvl w:ilvl="2" w:tplc="6010B3C8" w:tentative="1">
+    <w:lvl w:ilvl="2" w:tplc="15F82CEE" w:tentative="1">
       <w:start w:val="1"/>
       <w:numFmt w:val="bullet"/>
       <w:lvlText w:val="■"/>
@@ -4733,7 +5066,7 @@
         <w:ind w:left="2160" w:hanging="360"/>
       </w:pPr>
     </w:lvl>
-    <w:lvl w:ilvl="3" w:tplc="9060477A" w:tentative="1">
+    <w:lvl w:ilvl="3" w:tplc="FF90C02A" w:tentative="1">
       <w:start w:val="1"/>
       <w:numFmt w:val="bullet"/>
       <w:lvlText w:val="●"/>
@@ -4742,7 +5075,7 @@
         <w:ind w:left="2880" w:hanging="360"/>
       </w:pPr>
     </w:lvl>
-    <w:lvl w:ilvl="4" w:tplc="730632E2" w:tentative="1">
+    <w:lvl w:ilvl="4" w:tplc="7E249168" w:tentative="1">
       <w:start w:val="1"/>
       <w:numFmt w:val="bullet"/>
       <w:lvlText w:val="○"/>
@@ -4751,7 +5084,7 @@
         <w:ind w:left="3600" w:hanging="360"/>
       </w:pPr>
     </w:lvl>
-    <w:lvl w:ilvl="5" w:tplc="66403EC0" w:tentative="1">
+    <w:lvl w:ilvl="5" w:tplc="DB68CA4C" w:tentative="1">
       <w:start w:val="1"/>
       <w:numFmt w:val="bullet"/>
       <w:lvlText w:val="■"/>
@@ -4760,7 +5093,7 @@
         <w:ind w:left="4320" w:hanging="360"/>
       </w:pPr>
     </w:lvl>
-    <w:lvl w:ilvl="6" w:tplc="98DA535E" w:tentative="1">
+    <w:lvl w:ilvl="6" w:tplc="61B4CE3E" w:tentative="1">
       <w:start w:val="1"/>
       <w:numFmt w:val="bullet"/>
       <w:lvlText w:val="●"/>
@@ -4769,7 +5102,7 @@
         <w:ind w:left="5040" w:hanging="360"/>
       </w:pPr>
     </w:lvl>
-    <w:lvl w:ilvl="7" w:tplc="C7BADE6C" w:tentative="1">
+    <w:lvl w:ilvl="7" w:tplc="A6CA2BC4" w:tentative="1">
       <w:start w:val="1"/>
       <w:numFmt w:val="bullet"/>
       <w:lvlText w:val="●"/>
@@ -4778,7 +5111,7 @@
         <w:ind w:left="5760" w:hanging="360"/>
       </w:pPr>
     </w:lvl>
-    <w:lvl w:ilvl="8" w:tplc="7C3A629C" w:tentative="1">
+    <w:lvl w:ilvl="8" w:tplc="44B8D122" w:tentative="1">
       <w:start w:val="1"/>
       <w:numFmt w:val="bullet"/>
       <w:lvlText w:val="●"/>
@@ -4789,10 +5122,10 @@
     </w:lvl>
   </w:abstractNum>
   <w:abstractNum w:abstractNumId="2" w15:restartNumberingAfterBreak="0">
-    <w:nsid w:val="428D4E00"/>
+    <w:nsid w:val="53885CAB"/>
     <w:multiLevelType w:val="hybridMultilevel"/>
-    <w:tmpl w:val="440E4D1E"/>
-    <w:lvl w:ilvl="0" w:tplc="11622874">
+    <w:tmpl w:val="95A20DB4"/>
+    <w:lvl w:ilvl="0" w:tplc="2CE6D4C4">
       <w:start w:val="1"/>
       <w:numFmt w:val="bullet"/>
       <w:lvlText w:val="•"/>
@@ -4801,42 +5134,42 @@
         <w:ind w:left="720" w:hanging="360"/>
       </w:pPr>
     </w:lvl>
-    <w:lvl w:ilvl="1" w:tplc="3C0613C6">
+    <w:lvl w:ilvl="1" w:tplc="EC006BB8">
       <w:numFmt w:val="decimal"/>
       <w:lvlText w:val=""/>
       <w:lvlJc w:val="left"/>
     </w:lvl>
-    <w:lvl w:ilvl="2" w:tplc="E56AD82C">
+    <w:lvl w:ilvl="2" w:tplc="0546B03E">
       <w:numFmt w:val="decimal"/>
       <w:lvlText w:val=""/>
       <w:lvlJc w:val="left"/>
     </w:lvl>
-    <w:lvl w:ilvl="3" w:tplc="9204350A">
+    <w:lvl w:ilvl="3" w:tplc="DB3647D6">
       <w:numFmt w:val="decimal"/>
       <w:lvlText w:val=""/>
       <w:lvlJc w:val="left"/>
     </w:lvl>
-    <w:lvl w:ilvl="4" w:tplc="1218996C">
+    <w:lvl w:ilvl="4" w:tplc="4F5E2F92">
       <w:numFmt w:val="decimal"/>
       <w:lvlText w:val=""/>
       <w:lvlJc w:val="left"/>
     </w:lvl>
-    <w:lvl w:ilvl="5" w:tplc="7500E4FC">
+    <w:lvl w:ilvl="5" w:tplc="3C90C004">
       <w:numFmt w:val="decimal"/>
       <w:lvlText w:val=""/>
       <w:lvlJc w:val="left"/>
     </w:lvl>
-    <w:lvl w:ilvl="6" w:tplc="357639B0">
+    <w:lvl w:ilvl="6" w:tplc="04EE74F6">
       <w:numFmt w:val="decimal"/>
       <w:lvlText w:val=""/>
       <w:lvlJc w:val="left"/>
     </w:lvl>
-    <w:lvl w:ilvl="7" w:tplc="72D0097E">
+    <w:lvl w:ilvl="7" w:tplc="8682BFC6">
       <w:numFmt w:val="decimal"/>
       <w:lvlText w:val=""/>
       <w:lvlJc w:val="left"/>
     </w:lvl>
-    <w:lvl w:ilvl="8" w:tplc="74427C34">
+    <w:lvl w:ilvl="8" w:tplc="89308618">
       <w:numFmt w:val="decimal"/>
       <w:lvlText w:val=""/>
       <w:lvlJc w:val="left"/>
@@ -5483,16 +5816,19 @@
       <w:szCs w:val="20"/>
     </w:rPr>
   </w:style>
-  <w:style w:type="character" w:styleId="UnresolvedMention">
-    <w:name w:val="Unresolved Mention"/>
+  <w:style w:type="character" w:customStyle="1" w:styleId="fontstyle01">
+    <w:name w:val="fontstyle01"/>
     <w:basedOn w:val="DefaultParagraphFont"/>
-    <w:uiPriority w:val="99"/>
-    <w:semiHidden/>
-    <w:unhideWhenUsed/>
-    <w:rsid w:val="00D96CF0"/>
+    <w:rsid w:val="009F3C69"/>
     <w:rPr>
-      <w:color w:val="605E5C"/>
-      <w:shd w:val="clear" w:color="auto" w:fill="E1DFDD"/>
+      <w:rFonts w:ascii="CIDFont+F1" w:hAnsi="CIDFont+F1" w:hint="default"/>
+      <w:b w:val="0"/>
+      <w:bCs w:val="0"/>
+      <w:i w:val="0"/>
+      <w:iCs w:val="0"/>
+      <w:color w:val="000000"/>
+      <w:sz w:val="24"/>
+      <w:szCs w:val="24"/>
     </w:rPr>
   </w:style>
 </w:styles>

</xml_diff>